<commit_message>
Informe en Word con acentuacion correcta
</commit_message>
<xml_diff>
--- a/Informe_Hotel_Aurora.docx
+++ b/Informe_Hotel_Aurora.docx
@@ -54,9 +54,10 @@
       </w:pPr>
       <w:r>
         <w:rPr>
+          <w:b w:val="0"/>
           <w:sz w:val="24"/>
         </w:rPr>
-        <w:t>Ingenieria Web (2026-1)</w:t>
+        <w:t>Ingeniería Web (2026-1)</w:t>
       </w:r>
     </w:p>
     <w:p>
@@ -65,6 +66,7 @@
       </w:pPr>
       <w:r>
         <w:rPr>
+          <w:b w:val="0"/>
           <w:sz w:val="24"/>
         </w:rPr>
         <w:t>Universidad de Antioquia</w:t>
@@ -76,6 +78,7 @@
       </w:pPr>
       <w:r>
         <w:rPr>
+          <w:b w:val="0"/>
           <w:sz w:val="22"/>
         </w:rPr>
         <w:t>Profesor: Juan Pablo Arango</w:t>
@@ -87,6 +90,7 @@
       </w:pPr>
       <w:r>
         <w:rPr>
+          <w:b w:val="0"/>
           <w:sz w:val="12"/>
         </w:rPr>
       </w:r>
@@ -109,6 +113,7 @@
       </w:pPr>
       <w:r>
         <w:rPr>
+          <w:b w:val="0"/>
           <w:sz w:val="22"/>
         </w:rPr>
         <w:t>Gabriel Jaime Cardona Montoya</w:t>
@@ -120,9 +125,10 @@
       </w:pPr>
       <w:r>
         <w:rPr>
+          <w:b w:val="0"/>
           <w:sz w:val="22"/>
         </w:rPr>
-        <w:t>Andres David</w:t>
+        <w:t>Andrés David</w:t>
       </w:r>
     </w:p>
     <w:p>
@@ -131,9 +137,10 @@
       </w:pPr>
       <w:r>
         <w:rPr>
+          <w:b w:val="0"/>
           <w:sz w:val="22"/>
         </w:rPr>
-        <w:t>Mariana Martinez Gaviria</w:t>
+        <w:t>Mariana Martínez Gaviria</w:t>
       </w:r>
     </w:p>
     <w:p>
@@ -142,6 +149,7 @@
       </w:pPr>
       <w:r>
         <w:rPr>
+          <w:b w:val="0"/>
           <w:sz w:val="12"/>
         </w:rPr>
       </w:r>
@@ -152,6 +160,7 @@
       </w:pPr>
       <w:r>
         <w:rPr>
+          <w:b w:val="0"/>
           <w:sz w:val="22"/>
         </w:rPr>
         <w:t>Junio de 2026</w:t>
@@ -170,25 +179,23 @@
         <w:rPr>
           <w:color w:val="1F2B4A"/>
         </w:rPr>
-        <w:t>1. Introduccion</w:t>
+        <w:t>1. Introducción</w:t>
       </w:r>
     </w:p>
     <w:p>
       <w:r>
         <w:rPr>
-          <w:i w:val="0"/>
           <w:sz w:val="22"/>
         </w:rPr>
-        <w:t>Este documento presenta el proyecto final de la asignatura Ingenieria Web: un sistema de reservas para el Hotel Aurora. La aplicacion permite a los clientes consultar la disponibilidad de habitaciones y reservar en linea, y al personal del hotel administrar habitaciones, clientes y reservas, incluyendo el flujo operativo de check-in y check-out. El informe documenta la planeacion, los requisitos, el diseno de datos, los diagramas y las decisiones tecnicas que guiaron la construccion.</w:t>
+        <w:t>Este documento presenta el proyecto final de la asignatura Ingeniería Web: un sistema de reservas para el Hotel Aurora. La aplicación permite a los clientes consultar la disponibilidad de habitaciones y reservar en línea, y al personal del hotel administrar habitaciones, clientes y reservas, incluyendo el flujo operativo de check-in y check-out. El informe documenta la planeación, los requisitos, el diseño de datos, los diagramas y las decisiones técnicas que guiaron la construcción.</w:t>
       </w:r>
     </w:p>
     <w:p>
       <w:r>
         <w:rPr>
-          <w:i w:val="0"/>
           <w:sz w:val="22"/>
         </w:rPr>
-        <w:t>La aplicacion esta desarrollada con Next.js (App Router), React y TypeScript, con PostgreSQL a traves del ORM Prisma, y se encuentra desplegada y accesible en linea.</w:t>
+        <w:t>La aplicación está desarrollada con Next.js (App Router), React y TypeScript, con PostgreSQL a través del ORM Prisma, y se encuentra desplegada y accesible en línea.</w:t>
       </w:r>
     </w:p>
     <w:p>
@@ -199,7 +206,7 @@
         <w:rPr>
           <w:color w:val="1F2B4A"/>
         </w:rPr>
-        <w:t>2. Planeacion</w:t>
+        <w:t>2. Planeación</w:t>
       </w:r>
     </w:p>
     <w:p>
@@ -210,34 +217,31 @@
         <w:rPr>
           <w:color w:val="1F2B4A"/>
         </w:rPr>
-        <w:t>2.1 Vision y alcance</w:t>
+        <w:t>2.1 Visión y alcance</w:t>
       </w:r>
     </w:p>
     <w:p>
       <w:r>
         <w:rPr>
-          <w:i w:val="0"/>
           <w:sz w:val="22"/>
         </w:rPr>
-        <w:t>Vision: un sistema donde los clientes reservan habitaciones de forma autonoma y el personal gestiona la operacion diaria del hotel.</w:t>
+        <w:t>Visión: un sistema donde los clientes reservan habitaciones de forma autónoma y el personal gestiona la operación diaria del hotel.</w:t>
       </w:r>
     </w:p>
     <w:p>
       <w:r>
         <w:rPr>
-          <w:i w:val="0"/>
           <w:sz w:val="22"/>
         </w:rPr>
-        <w:t>Dentro del alcance: busqueda de disponibilidad, reserva en linea, gestion (CRUD) de habitaciones y clientes (datos maestros), gestion de reservas con check-in/check-out (datos transaccionales), panel con autenticacion y roles, y dashboard operativo.</w:t>
+        <w:t>Dentro del alcance: búsqueda de disponibilidad, reserva en línea, gestión (CRUD) de habitaciones y clientes (datos maestros), gestión de reservas con check-in/check-out (datos transaccionales), panel con autenticación y roles, y dashboard operativo.</w:t>
       </w:r>
     </w:p>
     <w:p>
       <w:r>
         <w:rPr>
-          <w:i w:val="0"/>
           <w:sz w:val="22"/>
         </w:rPr>
-        <w:t>Fuera del alcance (decision consciente para acotar el proyecto): pasarela de pago real, notificaciones por correo, tarifas dinamicas por temporada y aplicacion movil nativa.</w:t>
+        <w:t>Fuera del alcance (decisión consciente para acotar el proyecto): pasarela de pago real, notificaciones por correo, tarifas dinámicas por temporada y aplicación móvil nativa.</w:t>
       </w:r>
     </w:p>
     <w:p>
@@ -267,7 +271,6 @@
             <w:tcW w:type="dxa" w:w="4320"/>
           </w:tcPr>
           <w:p>
-            <w:r/>
             <w:r>
               <w:rPr>
                 <w:b/>
@@ -282,13 +285,12 @@
             <w:tcW w:type="dxa" w:w="4320"/>
           </w:tcPr>
           <w:p>
-            <w:r/>
             <w:r>
               <w:rPr>
                 <w:b/>
                 <w:sz w:val="20"/>
               </w:rPr>
-              <w:t>Descripcion</w:t>
+              <w:t>Descripción</w:t>
             </w:r>
           </w:p>
         </w:tc>
@@ -299,7 +301,6 @@
             <w:tcW w:type="dxa" w:w="4320"/>
           </w:tcPr>
           <w:p>
-            <w:r/>
             <w:r>
               <w:rPr>
                 <w:sz w:val="20"/>
@@ -313,12 +314,11 @@
             <w:tcW w:type="dxa" w:w="4320"/>
           </w:tcPr>
           <w:p>
-            <w:r/>
             <w:r>
               <w:rPr>
                 <w:sz w:val="20"/>
               </w:rPr>
-              <w:t>Usuario del sitio publico; busca y reserva. No requiere login.</w:t>
+              <w:t>Usuario del sitio público; busca y reserva. No requiere login.</w:t>
             </w:r>
           </w:p>
         </w:tc>
@@ -329,12 +329,11 @@
             <w:tcW w:type="dxa" w:w="4320"/>
           </w:tcPr>
           <w:p>
-            <w:r/>
             <w:r>
               <w:rPr>
                 <w:sz w:val="20"/>
               </w:rPr>
-              <w:t>Recepcion (PERSONAL)</w:t>
+              <w:t>Recepción (PERSONAL)</w:t>
             </w:r>
           </w:p>
         </w:tc>
@@ -343,12 +342,11 @@
             <w:tcW w:type="dxa" w:w="4320"/>
           </w:tcPr>
           <w:p>
-            <w:r/>
             <w:r>
               <w:rPr>
                 <w:sz w:val="20"/>
               </w:rPr>
-              <w:t>Operacion diaria: reservas, check-in/out, clientes.</w:t>
+              <w:t>Operación diaria: reservas, check-in/out, clientes.</w:t>
             </w:r>
           </w:p>
         </w:tc>
@@ -359,7 +357,6 @@
             <w:tcW w:type="dxa" w:w="4320"/>
           </w:tcPr>
           <w:p>
-            <w:r/>
             <w:r>
               <w:rPr>
                 <w:sz w:val="20"/>
@@ -373,7 +370,6 @@
             <w:tcW w:type="dxa" w:w="4320"/>
           </w:tcPr>
           <w:p>
-            <w:r/>
             <w:r>
               <w:rPr>
                 <w:sz w:val="20"/>
@@ -423,7 +419,6 @@
             <w:tcW w:type="dxa" w:w="4320"/>
           </w:tcPr>
           <w:p>
-            <w:r/>
             <w:r>
               <w:rPr>
                 <w:b/>
@@ -438,7 +433,6 @@
             <w:tcW w:type="dxa" w:w="4320"/>
           </w:tcPr>
           <w:p>
-            <w:r/>
             <w:r>
               <w:rPr>
                 <w:b/>
@@ -455,7 +449,6 @@
             <w:tcW w:type="dxa" w:w="4320"/>
           </w:tcPr>
           <w:p>
-            <w:r/>
             <w:r>
               <w:rPr>
                 <w:sz w:val="20"/>
@@ -469,12 +462,11 @@
             <w:tcW w:type="dxa" w:w="4320"/>
           </w:tcPr>
           <w:p>
-            <w:r/>
             <w:r>
               <w:rPr>
                 <w:sz w:val="20"/>
               </w:rPr>
-              <w:t>Buscar habitaciones disponibles por rango de fechas y numero de huespedes.</w:t>
+              <w:t>Buscar habitaciones disponibles por rango de fechas y número de huéspedes.</w:t>
             </w:r>
           </w:p>
         </w:tc>
@@ -485,7 +477,6 @@
             <w:tcW w:type="dxa" w:w="4320"/>
           </w:tcPr>
           <w:p>
-            <w:r/>
             <w:r>
               <w:rPr>
                 <w:sz w:val="20"/>
@@ -499,12 +490,11 @@
             <w:tcW w:type="dxa" w:w="4320"/>
           </w:tcPr>
           <w:p>
-            <w:r/>
             <w:r>
               <w:rPr>
                 <w:sz w:val="20"/>
               </w:rPr>
-              <w:t>Ver el detalle de una habitacion (fotos, servicios, precio, capacidad).</w:t>
+              <w:t>Ver el detalle de una habitación (fotos, servicios, precio, capacidad).</w:t>
             </w:r>
           </w:p>
         </w:tc>
@@ -515,7 +505,6 @@
             <w:tcW w:type="dxa" w:w="4320"/>
           </w:tcPr>
           <w:p>
-            <w:r/>
             <w:r>
               <w:rPr>
                 <w:sz w:val="20"/>
@@ -529,12 +518,11 @@
             <w:tcW w:type="dxa" w:w="4320"/>
           </w:tcPr>
           <w:p>
-            <w:r/>
             <w:r>
               <w:rPr>
                 <w:sz w:val="20"/>
               </w:rPr>
-              <w:t>Crear una reserva y recibir un codigo de confirmacion.</w:t>
+              <w:t>Crear una reserva y recibir un código de confirmación.</w:t>
             </w:r>
           </w:p>
         </w:tc>
@@ -545,7 +533,6 @@
             <w:tcW w:type="dxa" w:w="4320"/>
           </w:tcPr>
           <w:p>
-            <w:r/>
             <w:r>
               <w:rPr>
                 <w:sz w:val="20"/>
@@ -559,7 +546,6 @@
             <w:tcW w:type="dxa" w:w="4320"/>
           </w:tcPr>
           <w:p>
-            <w:r/>
             <w:r>
               <w:rPr>
                 <w:sz w:val="20"/>
@@ -575,7 +561,6 @@
             <w:tcW w:type="dxa" w:w="4320"/>
           </w:tcPr>
           <w:p>
-            <w:r/>
             <w:r>
               <w:rPr>
                 <w:sz w:val="20"/>
@@ -589,7 +574,6 @@
             <w:tcW w:type="dxa" w:w="4320"/>
           </w:tcPr>
           <w:p>
-            <w:r/>
             <w:r>
               <w:rPr>
                 <w:sz w:val="20"/>
@@ -605,7 +589,6 @@
             <w:tcW w:type="dxa" w:w="4320"/>
           </w:tcPr>
           <w:p>
-            <w:r/>
             <w:r>
               <w:rPr>
                 <w:sz w:val="20"/>
@@ -619,7 +602,6 @@
             <w:tcW w:type="dxa" w:w="4320"/>
           </w:tcPr>
           <w:p>
-            <w:r/>
             <w:r>
               <w:rPr>
                 <w:sz w:val="20"/>
@@ -635,7 +617,6 @@
             <w:tcW w:type="dxa" w:w="4320"/>
           </w:tcPr>
           <w:p>
-            <w:r/>
             <w:r>
               <w:rPr>
                 <w:sz w:val="20"/>
@@ -649,7 +630,6 @@
             <w:tcW w:type="dxa" w:w="4320"/>
           </w:tcPr>
           <w:p>
-            <w:r/>
             <w:r>
               <w:rPr>
                 <w:sz w:val="20"/>
@@ -665,7 +645,6 @@
             <w:tcW w:type="dxa" w:w="4320"/>
           </w:tcPr>
           <w:p>
-            <w:r/>
             <w:r>
               <w:rPr>
                 <w:sz w:val="20"/>
@@ -679,7 +658,6 @@
             <w:tcW w:type="dxa" w:w="4320"/>
           </w:tcPr>
           <w:p>
-            <w:r/>
             <w:r>
               <w:rPr>
                 <w:sz w:val="20"/>
@@ -695,7 +673,6 @@
             <w:tcW w:type="dxa" w:w="4320"/>
           </w:tcPr>
           <w:p>
-            <w:r/>
             <w:r>
               <w:rPr>
                 <w:sz w:val="20"/>
@@ -709,12 +686,11 @@
             <w:tcW w:type="dxa" w:w="4320"/>
           </w:tcPr>
           <w:p>
-            <w:r/>
             <w:r>
               <w:rPr>
                 <w:sz w:val="20"/>
               </w:rPr>
-              <w:t>Dashboard con ocupacion, llegadas/salidas del dia e ingresos.</w:t>
+              <w:t>Dashboard con ocupación, llegadas/salidas del día e ingresos.</w:t>
             </w:r>
           </w:p>
         </w:tc>
@@ -748,7 +724,6 @@
             <w:tcW w:type="dxa" w:w="4320"/>
           </w:tcPr>
           <w:p>
-            <w:r/>
             <w:r>
               <w:rPr>
                 <w:b/>
@@ -763,7 +738,6 @@
             <w:tcW w:type="dxa" w:w="4320"/>
           </w:tcPr>
           <w:p>
-            <w:r/>
             <w:r>
               <w:rPr>
                 <w:b/>
@@ -780,7 +754,6 @@
             <w:tcW w:type="dxa" w:w="4320"/>
           </w:tcPr>
           <w:p>
-            <w:r/>
             <w:r>
               <w:rPr>
                 <w:sz w:val="20"/>
@@ -794,12 +767,11 @@
             <w:tcW w:type="dxa" w:w="4320"/>
           </w:tcPr>
           <w:p>
-            <w:r/>
             <w:r>
               <w:rPr>
                 <w:sz w:val="20"/>
               </w:rPr>
-              <w:t>Nunca permitir doble reserva de una habitacion en fechas solapadas.</w:t>
+              <w:t>Nunca permitir doble reserva de una habitación en fechas solapadas.</w:t>
             </w:r>
           </w:p>
         </w:tc>
@@ -810,7 +782,6 @@
             <w:tcW w:type="dxa" w:w="4320"/>
           </w:tcPr>
           <w:p>
-            <w:r/>
             <w:r>
               <w:rPr>
                 <w:sz w:val="20"/>
@@ -824,12 +795,11 @@
             <w:tcW w:type="dxa" w:w="4320"/>
           </w:tcPr>
           <w:p>
-            <w:r/>
             <w:r>
               <w:rPr>
                 <w:sz w:val="20"/>
               </w:rPr>
-              <w:t>Contrasenas con hash; sesion firmada; el precio se calcula en el servidor.</w:t>
+              <w:t>Contraseñas con hash; sesión firmada; el precio se calcula en el servidor.</w:t>
             </w:r>
           </w:p>
         </w:tc>
@@ -840,7 +810,6 @@
             <w:tcW w:type="dxa" w:w="4320"/>
           </w:tcPr>
           <w:p>
-            <w:r/>
             <w:r>
               <w:rPr>
                 <w:sz w:val="20"/>
@@ -854,12 +823,11 @@
             <w:tcW w:type="dxa" w:w="4320"/>
           </w:tcPr>
           <w:p>
-            <w:r/>
             <w:r>
               <w:rPr>
                 <w:sz w:val="20"/>
               </w:rPr>
-              <w:t>Responsive, estados de carga/vacio/error, mensajes claros.</w:t>
+              <w:t>Responsive, estados de carga/vacío/error, mensajes claros.</w:t>
             </w:r>
           </w:p>
         </w:tc>
@@ -870,7 +838,6 @@
             <w:tcW w:type="dxa" w:w="4320"/>
           </w:tcPr>
           <w:p>
-            <w:r/>
             <w:r>
               <w:rPr>
                 <w:sz w:val="20"/>
@@ -884,12 +851,11 @@
             <w:tcW w:type="dxa" w:w="4320"/>
           </w:tcPr>
           <w:p>
-            <w:r/>
             <w:r>
               <w:rPr>
                 <w:sz w:val="20"/>
               </w:rPr>
-              <w:t>Codigo limpio, sin librerias innecesarias.</w:t>
+              <w:t>Código limpio, sin librerías innecesarias.</w:t>
             </w:r>
           </w:p>
         </w:tc>
@@ -900,7 +866,6 @@
             <w:tcW w:type="dxa" w:w="4320"/>
           </w:tcPr>
           <w:p>
-            <w:r/>
             <w:r>
               <w:rPr>
                 <w:sz w:val="20"/>
@@ -914,12 +879,11 @@
             <w:tcW w:type="dxa" w:w="4320"/>
           </w:tcPr>
           <w:p>
-            <w:r/>
             <w:r>
               <w:rPr>
                 <w:sz w:val="20"/>
               </w:rPr>
-              <w:t>Desplegado y accesible via link en vivo.</w:t>
+              <w:t>Desplegado y accesible vía link en vivo.</w:t>
             </w:r>
           </w:p>
         </w:tc>
@@ -955,7 +919,6 @@
             <w:tcW w:type="dxa" w:w="2160"/>
           </w:tcPr>
           <w:p>
-            <w:r/>
             <w:r>
               <w:rPr>
                 <w:b/>
@@ -970,7 +933,6 @@
             <w:tcW w:type="dxa" w:w="2160"/>
           </w:tcPr>
           <w:p>
-            <w:r/>
             <w:r>
               <w:rPr>
                 <w:b/>
@@ -985,7 +947,6 @@
             <w:tcW w:type="dxa" w:w="2160"/>
           </w:tcPr>
           <w:p>
-            <w:r/>
             <w:r>
               <w:rPr>
                 <w:b/>
@@ -1000,13 +961,12 @@
             <w:tcW w:type="dxa" w:w="2160"/>
           </w:tcPr>
           <w:p>
-            <w:r/>
             <w:r>
               <w:rPr>
                 <w:b/>
                 <w:sz w:val="20"/>
               </w:rPr>
-              <w:t>Criterio de aceptacion</w:t>
+              <w:t>Criterio de aceptación</w:t>
             </w:r>
           </w:p>
         </w:tc>
@@ -1017,7 +977,6 @@
             <w:tcW w:type="dxa" w:w="2160"/>
           </w:tcPr>
           <w:p>
-            <w:r/>
             <w:r>
               <w:rPr>
                 <w:sz w:val="20"/>
@@ -1031,7 +990,6 @@
             <w:tcW w:type="dxa" w:w="2160"/>
           </w:tcPr>
           <w:p>
-            <w:r/>
             <w:r>
               <w:rPr>
                 <w:sz w:val="20"/>
@@ -1045,7 +1003,6 @@
             <w:tcW w:type="dxa" w:w="2160"/>
           </w:tcPr>
           <w:p>
-            <w:r/>
             <w:r>
               <w:rPr>
                 <w:sz w:val="20"/>
@@ -1059,7 +1016,6 @@
             <w:tcW w:type="dxa" w:w="2160"/>
           </w:tcPr>
           <w:p>
-            <w:r/>
             <w:r>
               <w:rPr>
                 <w:sz w:val="20"/>
@@ -1075,7 +1031,6 @@
             <w:tcW w:type="dxa" w:w="2160"/>
           </w:tcPr>
           <w:p>
-            <w:r/>
             <w:r>
               <w:rPr>
                 <w:sz w:val="20"/>
@@ -1089,12 +1044,11 @@
             <w:tcW w:type="dxa" w:w="2160"/>
           </w:tcPr>
           <w:p>
-            <w:r/>
             <w:r>
               <w:rPr>
                 <w:sz w:val="20"/>
               </w:rPr>
-              <w:t>Ver detalle de habitacion</w:t>
+              <w:t>Ver detalle de habitación</w:t>
             </w:r>
           </w:p>
         </w:tc>
@@ -1103,7 +1057,6 @@
             <w:tcW w:type="dxa" w:w="2160"/>
           </w:tcPr>
           <w:p>
-            <w:r/>
             <w:r>
               <w:rPr>
                 <w:sz w:val="20"/>
@@ -1117,7 +1070,6 @@
             <w:tcW w:type="dxa" w:w="2160"/>
           </w:tcPr>
           <w:p>
-            <w:r/>
             <w:r>
               <w:rPr>
                 <w:sz w:val="20"/>
@@ -1133,7 +1085,6 @@
             <w:tcW w:type="dxa" w:w="2160"/>
           </w:tcPr>
           <w:p>
-            <w:r/>
             <w:r>
               <w:rPr>
                 <w:sz w:val="20"/>
@@ -1147,7 +1098,6 @@
             <w:tcW w:type="dxa" w:w="2160"/>
           </w:tcPr>
           <w:p>
-            <w:r/>
             <w:r>
               <w:rPr>
                 <w:sz w:val="20"/>
@@ -1161,7 +1111,6 @@
             <w:tcW w:type="dxa" w:w="2160"/>
           </w:tcPr>
           <w:p>
-            <w:r/>
             <w:r>
               <w:rPr>
                 <w:sz w:val="20"/>
@@ -1175,12 +1124,11 @@
             <w:tcW w:type="dxa" w:w="2160"/>
           </w:tcPr>
           <w:p>
-            <w:r/>
             <w:r>
               <w:rPr>
                 <w:sz w:val="20"/>
               </w:rPr>
-              <w:t>No deja reservar fechas ocupadas; entrega un codigo</w:t>
+              <w:t>No deja reservar fechas ocupadas; entrega un código</w:t>
             </w:r>
           </w:p>
         </w:tc>
@@ -1191,7 +1139,6 @@
             <w:tcW w:type="dxa" w:w="2160"/>
           </w:tcPr>
           <w:p>
-            <w:r/>
             <w:r>
               <w:rPr>
                 <w:sz w:val="20"/>
@@ -1205,7 +1152,6 @@
             <w:tcW w:type="dxa" w:w="2160"/>
           </w:tcPr>
           <w:p>
-            <w:r/>
             <w:r>
               <w:rPr>
                 <w:sz w:val="20"/>
@@ -1219,7 +1165,6 @@
             <w:tcW w:type="dxa" w:w="2160"/>
           </w:tcPr>
           <w:p>
-            <w:r/>
             <w:r>
               <w:rPr>
                 <w:sz w:val="20"/>
@@ -1233,7 +1178,6 @@
             <w:tcW w:type="dxa" w:w="2160"/>
           </w:tcPr>
           <w:p>
-            <w:r/>
             <w:r>
               <w:rPr>
                 <w:sz w:val="20"/>
@@ -1249,7 +1193,6 @@
             <w:tcW w:type="dxa" w:w="2160"/>
           </w:tcPr>
           <w:p>
-            <w:r/>
             <w:r>
               <w:rPr>
                 <w:sz w:val="20"/>
@@ -1263,7 +1206,6 @@
             <w:tcW w:type="dxa" w:w="2160"/>
           </w:tcPr>
           <w:p>
-            <w:r/>
             <w:r>
               <w:rPr>
                 <w:sz w:val="20"/>
@@ -1277,7 +1219,6 @@
             <w:tcW w:type="dxa" w:w="2160"/>
           </w:tcPr>
           <w:p>
-            <w:r/>
             <w:r>
               <w:rPr>
                 <w:sz w:val="20"/>
@@ -1291,12 +1232,11 @@
             <w:tcW w:type="dxa" w:w="2160"/>
           </w:tcPr>
           <w:p>
-            <w:r/>
             <w:r>
               <w:rPr>
                 <w:sz w:val="20"/>
               </w:rPr>
-              <w:t>Cambia estado de reserva y de habitacion</w:t>
+              <w:t>Cambia estado de reserva y de habitación</w:t>
             </w:r>
           </w:p>
         </w:tc>
@@ -1307,7 +1247,6 @@
             <w:tcW w:type="dxa" w:w="2160"/>
           </w:tcPr>
           <w:p>
-            <w:r/>
             <w:r>
               <w:rPr>
                 <w:sz w:val="20"/>
@@ -1321,7 +1260,6 @@
             <w:tcW w:type="dxa" w:w="2160"/>
           </w:tcPr>
           <w:p>
-            <w:r/>
             <w:r>
               <w:rPr>
                 <w:sz w:val="20"/>
@@ -1335,7 +1273,6 @@
             <w:tcW w:type="dxa" w:w="2160"/>
           </w:tcPr>
           <w:p>
-            <w:r/>
             <w:r>
               <w:rPr>
                 <w:sz w:val="20"/>
@@ -1349,12 +1286,11 @@
             <w:tcW w:type="dxa" w:w="2160"/>
           </w:tcPr>
           <w:p>
-            <w:r/>
             <w:r>
               <w:rPr>
                 <w:sz w:val="20"/>
               </w:rPr>
-              <w:t>Ocupacion, llegadas/salidas de hoy, ingresos</w:t>
+              <w:t>Ocupación, llegadas/salidas de hoy, ingresos</w:t>
             </w:r>
           </w:p>
         </w:tc>
@@ -1365,7 +1301,6 @@
             <w:tcW w:type="dxa" w:w="2160"/>
           </w:tcPr>
           <w:p>
-            <w:r/>
             <w:r>
               <w:rPr>
                 <w:sz w:val="20"/>
@@ -1379,7 +1314,6 @@
             <w:tcW w:type="dxa" w:w="2160"/>
           </w:tcPr>
           <w:p>
-            <w:r/>
             <w:r>
               <w:rPr>
                 <w:sz w:val="20"/>
@@ -1393,7 +1327,6 @@
             <w:tcW w:type="dxa" w:w="2160"/>
           </w:tcPr>
           <w:p>
-            <w:r/>
             <w:r>
               <w:rPr>
                 <w:sz w:val="20"/>
@@ -1407,7 +1340,6 @@
             <w:tcW w:type="dxa" w:w="2160"/>
           </w:tcPr>
           <w:p>
-            <w:r/>
             <w:r>
               <w:rPr>
                 <w:sz w:val="20"/>
@@ -1423,7 +1355,6 @@
             <w:tcW w:type="dxa" w:w="2160"/>
           </w:tcPr>
           <w:p>
-            <w:r/>
             <w:r>
               <w:rPr>
                 <w:sz w:val="20"/>
@@ -1437,7 +1368,6 @@
             <w:tcW w:type="dxa" w:w="2160"/>
           </w:tcPr>
           <w:p>
-            <w:r/>
             <w:r>
               <w:rPr>
                 <w:sz w:val="20"/>
@@ -1451,7 +1381,6 @@
             <w:tcW w:type="dxa" w:w="2160"/>
           </w:tcPr>
           <w:p>
-            <w:r/>
             <w:r>
               <w:rPr>
                 <w:sz w:val="20"/>
@@ -1465,7 +1394,6 @@
             <w:tcW w:type="dxa" w:w="2160"/>
           </w:tcPr>
           <w:p>
-            <w:r/>
             <w:r>
               <w:rPr>
                 <w:sz w:val="20"/>
@@ -1491,10 +1419,9 @@
     <w:p>
       <w:r>
         <w:rPr>
-          <w:i w:val="0"/>
           <w:sz w:val="22"/>
         </w:rPr>
-        <w:t>El diseno se organiza alrededor de dos conceptos: datos maestros (catalogo que se administra) y datos transaccionales (operaciones que ocurren muchas veces).</w:t>
+        <w:t>El diseño se organiza alrededor de dos conceptos: datos maestros (catálogo que se administra) y datos transaccionales (operaciones que ocurren muchas veces).</w:t>
       </w:r>
     </w:p>
     <w:p>
@@ -1546,7 +1473,7 @@
           <w:color w:val="AD7126"/>
           <w:sz w:val="18"/>
         </w:rPr>
-        <w:t>Figura 1. Diagrama Entidad-Relacion</w:t>
+        <w:t>Figura 1. Diagrama Entidad-Relación</w:t>
       </w:r>
     </w:p>
     <w:tbl>
@@ -1566,7 +1493,6 @@
             <w:tcW w:type="dxa" w:w="2880"/>
           </w:tcPr>
           <w:p>
-            <w:r/>
             <w:r>
               <w:rPr>
                 <w:b/>
@@ -1581,13 +1507,12 @@
             <w:tcW w:type="dxa" w:w="2880"/>
           </w:tcPr>
           <w:p>
-            <w:r/>
             <w:r>
               <w:rPr>
                 <w:b/>
                 <w:sz w:val="20"/>
               </w:rPr>
-              <w:t>Clasificacion</w:t>
+              <w:t>Clasificación</w:t>
             </w:r>
           </w:p>
         </w:tc>
@@ -1596,13 +1521,12 @@
             <w:tcW w:type="dxa" w:w="2880"/>
           </w:tcPr>
           <w:p>
-            <w:r/>
             <w:r>
               <w:rPr>
                 <w:b/>
                 <w:sz w:val="20"/>
               </w:rPr>
-              <w:t>Justificacion</w:t>
+              <w:t>Justificación</w:t>
             </w:r>
           </w:p>
         </w:tc>
@@ -1613,12 +1537,11 @@
             <w:tcW w:type="dxa" w:w="2880"/>
           </w:tcPr>
           <w:p>
-            <w:r/>
             <w:r>
               <w:rPr>
                 <w:sz w:val="20"/>
               </w:rPr>
-              <w:t>Habitacion</w:t>
+              <w:t>Habitación</w:t>
             </w:r>
           </w:p>
         </w:tc>
@@ -1627,7 +1550,6 @@
             <w:tcW w:type="dxa" w:w="2880"/>
           </w:tcPr>
           <w:p>
-            <w:r/>
             <w:r>
               <w:rPr>
                 <w:sz w:val="20"/>
@@ -1641,12 +1563,11 @@
             <w:tcW w:type="dxa" w:w="2880"/>
           </w:tcPr>
           <w:p>
-            <w:r/>
             <w:r>
               <w:rPr>
                 <w:sz w:val="20"/>
               </w:rPr>
-              <w:t>Catalogo del hotel; se da de alta/baja y cambia poco.</w:t>
+              <w:t>Catálogo del hotel; se da de alta/baja y cambia poco.</w:t>
             </w:r>
           </w:p>
         </w:tc>
@@ -1657,7 +1578,6 @@
             <w:tcW w:type="dxa" w:w="2880"/>
           </w:tcPr>
           <w:p>
-            <w:r/>
             <w:r>
               <w:rPr>
                 <w:sz w:val="20"/>
@@ -1671,7 +1591,6 @@
             <w:tcW w:type="dxa" w:w="2880"/>
           </w:tcPr>
           <w:p>
-            <w:r/>
             <w:r>
               <w:rPr>
                 <w:sz w:val="20"/>
@@ -1685,12 +1604,11 @@
             <w:tcW w:type="dxa" w:w="2880"/>
           </w:tcPr>
           <w:p>
-            <w:r/>
             <w:r>
               <w:rPr>
                 <w:sz w:val="20"/>
               </w:rPr>
-              <w:t>Registro de huespedes; se reutiliza entre reservas (clave: email).</w:t>
+              <w:t>Registro de huéspedes; se reutiliza entre reservas (clave: email).</w:t>
             </w:r>
           </w:p>
         </w:tc>
@@ -1701,7 +1619,6 @@
             <w:tcW w:type="dxa" w:w="2880"/>
           </w:tcPr>
           <w:p>
-            <w:r/>
             <w:r>
               <w:rPr>
                 <w:sz w:val="20"/>
@@ -1715,7 +1632,6 @@
             <w:tcW w:type="dxa" w:w="2880"/>
           </w:tcPr>
           <w:p>
-            <w:r/>
             <w:r>
               <w:rPr>
                 <w:sz w:val="20"/>
@@ -1729,12 +1645,11 @@
             <w:tcW w:type="dxa" w:w="2880"/>
           </w:tcPr>
           <w:p>
-            <w:r/>
             <w:r>
               <w:rPr>
                 <w:sz w:val="20"/>
               </w:rPr>
-              <w:t>Relaciona cliente y habitacion; cambia de estado en el tiempo.</w:t>
+              <w:t>Relaciona cliente y habitación; cambia de estado en el tiempo.</w:t>
             </w:r>
           </w:p>
         </w:tc>
@@ -1745,7 +1660,6 @@
             <w:tcW w:type="dxa" w:w="2880"/>
           </w:tcPr>
           <w:p>
-            <w:r/>
             <w:r>
               <w:rPr>
                 <w:sz w:val="20"/>
@@ -1759,7 +1673,6 @@
             <w:tcW w:type="dxa" w:w="2880"/>
           </w:tcPr>
           <w:p>
-            <w:r/>
             <w:r>
               <w:rPr>
                 <w:sz w:val="20"/>
@@ -1773,7 +1686,6 @@
             <w:tcW w:type="dxa" w:w="2880"/>
           </w:tcPr>
           <w:p>
-            <w:r/>
             <w:r>
               <w:rPr>
                 <w:sz w:val="20"/>
@@ -1788,10 +1700,9 @@
     <w:p>
       <w:r>
         <w:rPr>
-          <w:i w:val="0"/>
           <w:sz w:val="22"/>
         </w:rPr>
-        <w:t>Decision de modelado: la reserva guarda noches, total y codigo (no se recalculan despues), de modo que el historico queda fijo aunque cambie el precio de la habitacion.</w:t>
+        <w:t>Decisión de modelado: la reserva guarda noches, total y código (no se recalculan después), de modo que el histórico queda fijo aunque cambie el precio de la habitación.</w:t>
       </w:r>
     </w:p>
     <w:p>
@@ -1802,7 +1713,7 @@
         <w:rPr>
           <w:color w:val="1F2B4A"/>
         </w:rPr>
-        <w:t>5. Diagramas de diseno</w:t>
+        <w:t>5. Diagramas de diseño</w:t>
       </w:r>
     </w:p>
     <w:p>
@@ -1865,16 +1776,15 @@
           <w:color w:val="AD7126"/>
           <w:sz w:val="18"/>
         </w:rPr>
-        <w:t>Figura 2. Flujo de creacion de una reserva</w:t>
+        <w:t>Figura 2. Flujo de creación de una reserva</w:t>
       </w:r>
     </w:p>
     <w:p>
       <w:r>
         <w:rPr>
-          <w:i w:val="0"/>
           <w:sz w:val="22"/>
         </w:rPr>
-        <w:t>La disponibilidad se re-verifica dentro de la accion del servidor antes de insertar, no solo en el buscador, para evitar condiciones de carrera (RNF1).</w:t>
+        <w:t>La disponibilidad se re-verifica dentro de la acción del servidor antes de insertar, no solo en el buscador, para evitar condiciones de carrera (RNF1).</w:t>
       </w:r>
     </w:p>
     <w:p>
@@ -1937,7 +1847,7 @@
           <w:color w:val="AD7126"/>
           <w:sz w:val="18"/>
         </w:rPr>
-        <w:t>Figura 3. Maquina de estados de la reserva</w:t>
+        <w:t>Figura 3. Máquina de estados de la reserva</w:t>
       </w:r>
     </w:p>
     <w:p>
@@ -2006,7 +1916,6 @@
     <w:p>
       <w:r>
         <w:rPr>
-          <w:i w:val="0"/>
           <w:sz w:val="22"/>
         </w:rPr>
         <w:t>Los Server Components leen datos; las Server Actions escriben y revalidan la vista; Prisma traduce a SQL sobre PostgreSQL.</w:t>
@@ -2020,16 +1929,15 @@
         <w:rPr>
           <w:color w:val="1F2B4A"/>
         </w:rPr>
-        <w:t>6. Decisiones tecnicas (ADR)</w:t>
+        <w:t>6. Decisiones técnicas (ADR)</w:t>
       </w:r>
     </w:p>
     <w:p>
       <w:r>
         <w:rPr>
-          <w:i w:val="0"/>
           <w:sz w:val="22"/>
         </w:rPr>
-        <w:t>Cada decision importante de construccion, con la alternativa que se considero y el porque de la eleccion. Esto evidencia que las decisiones fueron pensadas.</w:t>
+        <w:t>Cada decisión importante de construcción, con la alternativa que se consideró y el porqué de la elección. Esto evidencia que las decisiones fueron pensadas.</w:t>
       </w:r>
     </w:p>
     <w:tbl>
@@ -2049,13 +1957,12 @@
             <w:tcW w:type="dxa" w:w="2880"/>
           </w:tcPr>
           <w:p>
-            <w:r/>
             <w:r>
               <w:rPr>
                 <w:b/>
                 <w:sz w:val="20"/>
               </w:rPr>
-              <w:t>Decision</w:t>
+              <w:t>Decisión</w:t>
             </w:r>
           </w:p>
         </w:tc>
@@ -2064,7 +1971,6 @@
             <w:tcW w:type="dxa" w:w="2880"/>
           </w:tcPr>
           <w:p>
-            <w:r/>
             <w:r>
               <w:rPr>
                 <w:b/>
@@ -2079,13 +1985,12 @@
             <w:tcW w:type="dxa" w:w="2880"/>
           </w:tcPr>
           <w:p>
-            <w:r/>
             <w:r>
               <w:rPr>
                 <w:b/>
                 <w:sz w:val="20"/>
               </w:rPr>
-              <w:t>Eleccion y porque</w:t>
+              <w:t>Elección y porqué</w:t>
             </w:r>
           </w:p>
         </w:tc>
@@ -2096,7 +2001,6 @@
             <w:tcW w:type="dxa" w:w="2880"/>
           </w:tcPr>
           <w:p>
-            <w:r/>
             <w:r>
               <w:rPr>
                 <w:sz w:val="20"/>
@@ -2110,7 +2014,6 @@
             <w:tcW w:type="dxa" w:w="2880"/>
           </w:tcPr>
           <w:p>
-            <w:r/>
             <w:r>
               <w:rPr>
                 <w:sz w:val="20"/>
@@ -2124,7 +2027,6 @@
             <w:tcW w:type="dxa" w:w="2880"/>
           </w:tcPr>
           <w:p>
-            <w:r/>
             <w:r>
               <w:rPr>
                 <w:sz w:val="20"/>
@@ -2140,7 +2042,6 @@
             <w:tcW w:type="dxa" w:w="2880"/>
           </w:tcPr>
           <w:p>
-            <w:r/>
             <w:r>
               <w:rPr>
                 <w:sz w:val="20"/>
@@ -2154,7 +2055,6 @@
             <w:tcW w:type="dxa" w:w="2880"/>
           </w:tcPr>
           <w:p>
-            <w:r/>
             <w:r>
               <w:rPr>
                 <w:sz w:val="20"/>
@@ -2168,12 +2068,11 @@
             <w:tcW w:type="dxa" w:w="2880"/>
           </w:tcPr>
           <w:p>
-            <w:r/>
             <w:r>
               <w:rPr>
                 <w:sz w:val="20"/>
               </w:rPr>
-              <w:t>Server Actions: menos codigo, type-safe, revalidacion directa.</w:t>
+              <w:t>Server Actions: menos código, type-safe, revalidación directa.</w:t>
             </w:r>
           </w:p>
         </w:tc>
@@ -2184,7 +2083,6 @@
             <w:tcW w:type="dxa" w:w="2880"/>
           </w:tcPr>
           <w:p>
-            <w:r/>
             <w:r>
               <w:rPr>
                 <w:sz w:val="20"/>
@@ -2198,7 +2096,6 @@
             <w:tcW w:type="dxa" w:w="2880"/>
           </w:tcPr>
           <w:p>
-            <w:r/>
             <w:r>
               <w:rPr>
                 <w:sz w:val="20"/>
@@ -2212,12 +2109,11 @@
             <w:tcW w:type="dxa" w:w="2880"/>
           </w:tcPr>
           <w:p>
-            <w:r/>
             <w:r>
               <w:rPr>
                 <w:sz w:val="20"/>
               </w:rPr>
-              <w:t>PostgreSQL + Prisma: persistencia real en el hosting de produccion.</w:t>
+              <w:t>PostgreSQL + Prisma: persistencia real en el hosting de producción.</w:t>
             </w:r>
           </w:p>
         </w:tc>
@@ -2228,12 +2124,11 @@
             <w:tcW w:type="dxa" w:w="2880"/>
           </w:tcPr>
           <w:p>
-            <w:r/>
             <w:r>
               <w:rPr>
                 <w:sz w:val="20"/>
               </w:rPr>
-              <w:t>Autenticacion</w:t>
+              <w:t>Autenticación</w:t>
             </w:r>
           </w:p>
         </w:tc>
@@ -2242,7 +2137,6 @@
             <w:tcW w:type="dxa" w:w="2880"/>
           </w:tcPr>
           <w:p>
-            <w:r/>
             <w:r>
               <w:rPr>
                 <w:sz w:val="20"/>
@@ -2256,12 +2150,11 @@
             <w:tcW w:type="dxa" w:w="2880"/>
           </w:tcPr>
           <w:p>
-            <w:r/>
             <w:r>
               <w:rPr>
                 <w:sz w:val="20"/>
               </w:rPr>
-              <w:t>Sesion propia (scrypt + cookie HMAC): caso simple, sin dependencia pesada.</w:t>
+              <w:t>Sesión propia (scrypt + cookie HMAC): caso simple, sin dependencia pesada.</w:t>
             </w:r>
           </w:p>
         </w:tc>
@@ -2272,7 +2165,6 @@
             <w:tcW w:type="dxa" w:w="2880"/>
           </w:tcPr>
           <w:p>
-            <w:r/>
             <w:r>
               <w:rPr>
                 <w:sz w:val="20"/>
@@ -2286,7 +2178,6 @@
             <w:tcW w:type="dxa" w:w="2880"/>
           </w:tcPr>
           <w:p>
-            <w:r/>
             <w:r>
               <w:rPr>
                 <w:sz w:val="20"/>
@@ -2300,12 +2191,11 @@
             <w:tcW w:type="dxa" w:w="2880"/>
           </w:tcPr>
           <w:p>
-            <w:r/>
             <w:r>
               <w:rPr>
                 <w:sz w:val="20"/>
               </w:rPr>
-              <w:t>Re-verificar disponibilidad dentro de la accion al confirmar.</w:t>
+              <w:t>Re-verificar disponibilidad dentro de la acción al confirmar.</w:t>
             </w:r>
           </w:p>
         </w:tc>
@@ -2316,12 +2206,11 @@
             <w:tcW w:type="dxa" w:w="2880"/>
           </w:tcPr>
           <w:p>
-            <w:r/>
             <w:r>
               <w:rPr>
                 <w:sz w:val="20"/>
               </w:rPr>
-              <w:t>Render</w:t>
+              <w:t>Render UI</w:t>
             </w:r>
           </w:p>
         </w:tc>
@@ -2330,7 +2219,6 @@
             <w:tcW w:type="dxa" w:w="2880"/>
           </w:tcPr>
           <w:p>
-            <w:r/>
             <w:r>
               <w:rPr>
                 <w:sz w:val="20"/>
@@ -2344,12 +2232,11 @@
             <w:tcW w:type="dxa" w:w="2880"/>
           </w:tcPr>
           <w:p>
-            <w:r/>
             <w:r>
               <w:rPr>
                 <w:sz w:val="20"/>
               </w:rPr>
-              <w:t>Server Components por defecto; 'use client' solo si hay interaccion.</w:t>
+              <w:t>Server Components por defecto; 'use client' solo si hay interacción.</w:t>
             </w:r>
           </w:p>
         </w:tc>
@@ -2360,12 +2247,11 @@
             <w:tcW w:type="dxa" w:w="2880"/>
           </w:tcPr>
           <w:p>
-            <w:r/>
             <w:r>
               <w:rPr>
                 <w:sz w:val="20"/>
               </w:rPr>
-              <w:t>Autorizacion</w:t>
+              <w:t>Autorización</w:t>
             </w:r>
           </w:p>
         </w:tc>
@@ -2374,7 +2260,6 @@
             <w:tcW w:type="dxa" w:w="2880"/>
           </w:tcPr>
           <w:p>
-            <w:r/>
             <w:r>
               <w:rPr>
                 <w:sz w:val="20"/>
@@ -2388,12 +2273,11 @@
             <w:tcW w:type="dxa" w:w="2880"/>
           </w:tcPr>
           <w:p>
-            <w:r/>
             <w:r>
               <w:rPr>
                 <w:sz w:val="20"/>
               </w:rPr>
-              <w:t>Validar tambien en el servidor (la UI no es seguridad).</w:t>
+              <w:t>Validar también en el servidor (la UI no es seguridad).</w:t>
             </w:r>
           </w:p>
         </w:tc>
@@ -2404,12 +2288,11 @@
             <w:tcW w:type="dxa" w:w="2880"/>
           </w:tcPr>
           <w:p>
-            <w:r/>
             <w:r>
               <w:rPr>
                 <w:sz w:val="20"/>
               </w:rPr>
-              <w:t>Calculo del total</w:t>
+              <w:t>Cálculo del total</w:t>
             </w:r>
           </w:p>
         </w:tc>
@@ -2418,7 +2301,6 @@
             <w:tcW w:type="dxa" w:w="2880"/>
           </w:tcPr>
           <w:p>
-            <w:r/>
             <w:r>
               <w:rPr>
                 <w:sz w:val="20"/>
@@ -2432,7 +2314,6 @@
             <w:tcW w:type="dxa" w:w="2880"/>
           </w:tcPr>
           <w:p>
-            <w:r/>
             <w:r>
               <w:rPr>
                 <w:sz w:val="20"/>
@@ -2448,7 +2329,6 @@
             <w:tcW w:type="dxa" w:w="2880"/>
           </w:tcPr>
           <w:p>
-            <w:r/>
             <w:r>
               <w:rPr>
                 <w:sz w:val="20"/>
@@ -2462,12 +2342,11 @@
             <w:tcW w:type="dxa" w:w="2880"/>
           </w:tcPr>
           <w:p>
-            <w:r/>
             <w:r>
               <w:rPr>
                 <w:sz w:val="20"/>
               </w:rPr>
-              <w:t>Libreria de UI pesada</w:t>
+              <w:t>Librería de UI pesada</w:t>
             </w:r>
           </w:p>
         </w:tc>
@@ -2476,12 +2355,11 @@
             <w:tcW w:type="dxa" w:w="2880"/>
           </w:tcPr>
           <w:p>
-            <w:r/>
             <w:r>
               <w:rPr>
                 <w:sz w:val="20"/>
               </w:rPr>
-              <w:t>Tailwind + componentes propios + helper cn(): dependencias minimas.</w:t>
+              <w:t>Tailwind + componentes propios + helper cn(): dependencias mínimas.</w:t>
             </w:r>
           </w:p>
         </w:tc>
@@ -2517,13 +2395,12 @@
             <w:tcW w:type="dxa" w:w="2160"/>
           </w:tcPr>
           <w:p>
-            <w:r/>
             <w:r>
               <w:rPr>
                 <w:b/>
                 <w:sz w:val="20"/>
               </w:rPr>
-              <w:t>Accion</w:t>
+              <w:t>Acción</w:t>
             </w:r>
           </w:p>
         </w:tc>
@@ -2532,7 +2409,6 @@
             <w:tcW w:type="dxa" w:w="2160"/>
           </w:tcPr>
           <w:p>
-            <w:r/>
             <w:r>
               <w:rPr>
                 <w:b/>
@@ -2547,13 +2423,12 @@
             <w:tcW w:type="dxa" w:w="2160"/>
           </w:tcPr>
           <w:p>
-            <w:r/>
             <w:r>
               <w:rPr>
                 <w:b/>
                 <w:sz w:val="20"/>
               </w:rPr>
-              <w:t>Recepcion</w:t>
+              <w:t>Recepción</w:t>
             </w:r>
           </w:p>
         </w:tc>
@@ -2562,7 +2437,6 @@
             <w:tcW w:type="dxa" w:w="2160"/>
           </w:tcPr>
           <w:p>
-            <w:r/>
             <w:r>
               <w:rPr>
                 <w:b/>
@@ -2579,12 +2453,11 @@
             <w:tcW w:type="dxa" w:w="2160"/>
           </w:tcPr>
           <w:p>
-            <w:r/>
             <w:r>
               <w:rPr>
                 <w:sz w:val="20"/>
               </w:rPr>
-              <w:t>Buscar y reservar (publico)</w:t>
+              <w:t>Buscar y reservar (público)</w:t>
             </w:r>
           </w:p>
         </w:tc>
@@ -2593,12 +2466,11 @@
             <w:tcW w:type="dxa" w:w="2160"/>
           </w:tcPr>
           <w:p>
-            <w:r/>
             <w:r>
               <w:rPr>
                 <w:sz w:val="20"/>
               </w:rPr>
-              <w:t>Si</w:t>
+              <w:t>Sí</w:t>
             </w:r>
           </w:p>
         </w:tc>
@@ -2607,12 +2479,11 @@
             <w:tcW w:type="dxa" w:w="2160"/>
           </w:tcPr>
           <w:p>
-            <w:r/>
             <w:r>
               <w:rPr>
                 <w:sz w:val="20"/>
               </w:rPr>
-              <w:t>Si</w:t>
+              <w:t>Sí</w:t>
             </w:r>
           </w:p>
         </w:tc>
@@ -2621,12 +2492,11 @@
             <w:tcW w:type="dxa" w:w="2160"/>
           </w:tcPr>
           <w:p>
-            <w:r/>
             <w:r>
               <w:rPr>
                 <w:sz w:val="20"/>
               </w:rPr>
-              <w:t>Si</w:t>
+              <w:t>Sí</w:t>
             </w:r>
           </w:p>
         </w:tc>
@@ -2637,7 +2507,6 @@
             <w:tcW w:type="dxa" w:w="2160"/>
           </w:tcPr>
           <w:p>
-            <w:r/>
             <w:r>
               <w:rPr>
                 <w:sz w:val="20"/>
@@ -2651,7 +2520,6 @@
             <w:tcW w:type="dxa" w:w="2160"/>
           </w:tcPr>
           <w:p>
-            <w:r/>
             <w:r>
               <w:rPr>
                 <w:sz w:val="20"/>
@@ -2665,12 +2533,11 @@
             <w:tcW w:type="dxa" w:w="2160"/>
           </w:tcPr>
           <w:p>
-            <w:r/>
             <w:r>
               <w:rPr>
                 <w:sz w:val="20"/>
               </w:rPr>
-              <w:t>Si</w:t>
+              <w:t>Sí</w:t>
             </w:r>
           </w:p>
         </w:tc>
@@ -2679,12 +2546,11 @@
             <w:tcW w:type="dxa" w:w="2160"/>
           </w:tcPr>
           <w:p>
-            <w:r/>
             <w:r>
               <w:rPr>
                 <w:sz w:val="20"/>
               </w:rPr>
-              <w:t>Si</w:t>
+              <w:t>Sí</w:t>
             </w:r>
           </w:p>
         </w:tc>
@@ -2695,7 +2561,6 @@
             <w:tcW w:type="dxa" w:w="2160"/>
           </w:tcPr>
           <w:p>
-            <w:r/>
             <w:r>
               <w:rPr>
                 <w:sz w:val="20"/>
@@ -2709,7 +2574,6 @@
             <w:tcW w:type="dxa" w:w="2160"/>
           </w:tcPr>
           <w:p>
-            <w:r/>
             <w:r>
               <w:rPr>
                 <w:sz w:val="20"/>
@@ -2723,12 +2587,11 @@
             <w:tcW w:type="dxa" w:w="2160"/>
           </w:tcPr>
           <w:p>
-            <w:r/>
             <w:r>
               <w:rPr>
                 <w:sz w:val="20"/>
               </w:rPr>
-              <w:t>Si</w:t>
+              <w:t>Sí</w:t>
             </w:r>
           </w:p>
         </w:tc>
@@ -2737,12 +2600,11 @@
             <w:tcW w:type="dxa" w:w="2160"/>
           </w:tcPr>
           <w:p>
-            <w:r/>
             <w:r>
               <w:rPr>
                 <w:sz w:val="20"/>
               </w:rPr>
-              <w:t>Si</w:t>
+              <w:t>Sí</w:t>
             </w:r>
           </w:p>
         </w:tc>
@@ -2753,7 +2615,6 @@
             <w:tcW w:type="dxa" w:w="2160"/>
           </w:tcPr>
           <w:p>
-            <w:r/>
             <w:r>
               <w:rPr>
                 <w:sz w:val="20"/>
@@ -2767,7 +2628,6 @@
             <w:tcW w:type="dxa" w:w="2160"/>
           </w:tcPr>
           <w:p>
-            <w:r/>
             <w:r>
               <w:rPr>
                 <w:sz w:val="20"/>
@@ -2781,12 +2641,11 @@
             <w:tcW w:type="dxa" w:w="2160"/>
           </w:tcPr>
           <w:p>
-            <w:r/>
             <w:r>
               <w:rPr>
                 <w:sz w:val="20"/>
               </w:rPr>
-              <w:t>Si</w:t>
+              <w:t>Sí</w:t>
             </w:r>
           </w:p>
         </w:tc>
@@ -2795,12 +2654,11 @@
             <w:tcW w:type="dxa" w:w="2160"/>
           </w:tcPr>
           <w:p>
-            <w:r/>
             <w:r>
               <w:rPr>
                 <w:sz w:val="20"/>
               </w:rPr>
-              <w:t>Si</w:t>
+              <w:t>Sí</w:t>
             </w:r>
           </w:p>
         </w:tc>
@@ -2811,12 +2669,11 @@
             <w:tcW w:type="dxa" w:w="2160"/>
           </w:tcPr>
           <w:p>
-            <w:r/>
             <w:r>
               <w:rPr>
                 <w:sz w:val="20"/>
               </w:rPr>
-              <w:t>Cambiar estado de habitacion</w:t>
+              <w:t>Cambiar estado de habitación</w:t>
             </w:r>
           </w:p>
         </w:tc>
@@ -2825,7 +2682,6 @@
             <w:tcW w:type="dxa" w:w="2160"/>
           </w:tcPr>
           <w:p>
-            <w:r/>
             <w:r>
               <w:rPr>
                 <w:sz w:val="20"/>
@@ -2839,12 +2695,11 @@
             <w:tcW w:type="dxa" w:w="2160"/>
           </w:tcPr>
           <w:p>
-            <w:r/>
             <w:r>
               <w:rPr>
                 <w:sz w:val="20"/>
               </w:rPr>
-              <w:t>Si</w:t>
+              <w:t>Sí</w:t>
             </w:r>
           </w:p>
         </w:tc>
@@ -2853,12 +2708,11 @@
             <w:tcW w:type="dxa" w:w="2160"/>
           </w:tcPr>
           <w:p>
-            <w:r/>
             <w:r>
               <w:rPr>
                 <w:sz w:val="20"/>
               </w:rPr>
-              <w:t>Si</w:t>
+              <w:t>Sí</w:t>
             </w:r>
           </w:p>
         </w:tc>
@@ -2869,7 +2723,6 @@
             <w:tcW w:type="dxa" w:w="2160"/>
           </w:tcPr>
           <w:p>
-            <w:r/>
             <w:r>
               <w:rPr>
                 <w:sz w:val="20"/>
@@ -2883,7 +2736,6 @@
             <w:tcW w:type="dxa" w:w="2160"/>
           </w:tcPr>
           <w:p>
-            <w:r/>
             <w:r>
               <w:rPr>
                 <w:sz w:val="20"/>
@@ -2897,7 +2749,6 @@
             <w:tcW w:type="dxa" w:w="2160"/>
           </w:tcPr>
           <w:p>
-            <w:r/>
             <w:r>
               <w:rPr>
                 <w:sz w:val="20"/>
@@ -2911,12 +2762,11 @@
             <w:tcW w:type="dxa" w:w="2160"/>
           </w:tcPr>
           <w:p>
-            <w:r/>
             <w:r>
               <w:rPr>
                 <w:sz w:val="20"/>
               </w:rPr>
-              <w:t>Si</w:t>
+              <w:t>Sí</w:t>
             </w:r>
           </w:p>
         </w:tc>
@@ -2927,7 +2777,6 @@
             <w:tcW w:type="dxa" w:w="2160"/>
           </w:tcPr>
           <w:p>
-            <w:r/>
             <w:r>
               <w:rPr>
                 <w:sz w:val="20"/>
@@ -2941,7 +2790,6 @@
             <w:tcW w:type="dxa" w:w="2160"/>
           </w:tcPr>
           <w:p>
-            <w:r/>
             <w:r>
               <w:rPr>
                 <w:sz w:val="20"/>
@@ -2955,7 +2803,6 @@
             <w:tcW w:type="dxa" w:w="2160"/>
           </w:tcPr>
           <w:p>
-            <w:r/>
             <w:r>
               <w:rPr>
                 <w:sz w:val="20"/>
@@ -2969,12 +2816,11 @@
             <w:tcW w:type="dxa" w:w="2160"/>
           </w:tcPr>
           <w:p>
-            <w:r/>
             <w:r>
               <w:rPr>
                 <w:sz w:val="20"/>
               </w:rPr>
-              <w:t>Si</w:t>
+              <w:t>Sí</w:t>
             </w:r>
           </w:p>
         </w:tc>
@@ -2984,10 +2830,9 @@
     <w:p>
       <w:r>
         <w:rPr>
-          <w:i w:val="0"/>
           <w:sz w:val="22"/>
         </w:rPr>
-        <w:t>Las dos ultimas filas se aplican en el servidor (Server Actions) y se ocultan en la interfaz.</w:t>
+        <w:t>Las dos últimas filas se aplican en el servidor (Server Actions) y se ocultan en la interfaz.</w:t>
       </w:r>
     </w:p>
     <w:p>
@@ -2998,7 +2843,7 @@
         <w:rPr>
           <w:color w:val="1F2B4A"/>
         </w:rPr>
-        <w:t>8. Tecnologias y despliegue</w:t>
+        <w:t>8. Tecnologías y despliegue</w:t>
       </w:r>
     </w:p>
     <w:tbl>
@@ -3017,7 +2862,6 @@
             <w:tcW w:type="dxa" w:w="4320"/>
           </w:tcPr>
           <w:p>
-            <w:r/>
             <w:r>
               <w:rPr>
                 <w:b/>
@@ -3032,13 +2876,12 @@
             <w:tcW w:type="dxa" w:w="4320"/>
           </w:tcPr>
           <w:p>
-            <w:r/>
             <w:r>
               <w:rPr>
                 <w:b/>
                 <w:sz w:val="20"/>
               </w:rPr>
-              <w:t>Tecnologia</w:t>
+              <w:t>Tecnología</w:t>
             </w:r>
           </w:p>
         </w:tc>
@@ -3049,7 +2892,6 @@
             <w:tcW w:type="dxa" w:w="4320"/>
           </w:tcPr>
           <w:p>
-            <w:r/>
             <w:r>
               <w:rPr>
                 <w:sz w:val="20"/>
@@ -3063,7 +2905,6 @@
             <w:tcW w:type="dxa" w:w="4320"/>
           </w:tcPr>
           <w:p>
-            <w:r/>
             <w:r>
               <w:rPr>
                 <w:sz w:val="20"/>
@@ -3079,7 +2920,6 @@
             <w:tcW w:type="dxa" w:w="4320"/>
           </w:tcPr>
           <w:p>
-            <w:r/>
             <w:r>
               <w:rPr>
                 <w:sz w:val="20"/>
@@ -3093,12 +2933,11 @@
             <w:tcW w:type="dxa" w:w="4320"/>
           </w:tcPr>
           <w:p>
-            <w:r/>
             <w:r>
               <w:rPr>
                 <w:sz w:val="20"/>
               </w:rPr>
-              <w:t>Tailwind CSS (diseno propio)</w:t>
+              <w:t>Tailwind CSS (diseño propio)</w:t>
             </w:r>
           </w:p>
         </w:tc>
@@ -3109,7 +2948,6 @@
             <w:tcW w:type="dxa" w:w="4320"/>
           </w:tcPr>
           <w:p>
-            <w:r/>
             <w:r>
               <w:rPr>
                 <w:sz w:val="20"/>
@@ -3123,7 +2961,6 @@
             <w:tcW w:type="dxa" w:w="4320"/>
           </w:tcPr>
           <w:p>
-            <w:r/>
             <w:r>
               <w:rPr>
                 <w:sz w:val="20"/>
@@ -3139,12 +2976,11 @@
             <w:tcW w:type="dxa" w:w="4320"/>
           </w:tcPr>
           <w:p>
-            <w:r/>
             <w:r>
               <w:rPr>
                 <w:sz w:val="20"/>
               </w:rPr>
-              <w:t>Logica de servidor</w:t>
+              <w:t>Lógica de servidor</w:t>
             </w:r>
           </w:p>
         </w:tc>
@@ -3153,7 +2989,6 @@
             <w:tcW w:type="dxa" w:w="4320"/>
           </w:tcPr>
           <w:p>
-            <w:r/>
             <w:r>
               <w:rPr>
                 <w:sz w:val="20"/>
@@ -3169,12 +3004,11 @@
             <w:tcW w:type="dxa" w:w="4320"/>
           </w:tcPr>
           <w:p>
-            <w:r/>
             <w:r>
               <w:rPr>
                 <w:sz w:val="20"/>
               </w:rPr>
-              <w:t>Autenticacion</w:t>
+              <w:t>Autenticación</w:t>
             </w:r>
           </w:p>
         </w:tc>
@@ -3183,12 +3017,11 @@
             <w:tcW w:type="dxa" w:w="4320"/>
           </w:tcPr>
           <w:p>
-            <w:r/>
             <w:r>
               <w:rPr>
                 <w:sz w:val="20"/>
               </w:rPr>
-              <w:t>Sesion por cookie firmada (HMAC) + scrypt</w:t>
+              <w:t>Sesión por cookie firmada (HMAC) + scrypt</w:t>
             </w:r>
           </w:p>
         </w:tc>
@@ -3199,7 +3032,6 @@
             <w:tcW w:type="dxa" w:w="4320"/>
           </w:tcPr>
           <w:p>
-            <w:r/>
             <w:r>
               <w:rPr>
                 <w:sz w:val="20"/>
@@ -3213,7 +3045,6 @@
             <w:tcW w:type="dxa" w:w="4320"/>
           </w:tcPr>
           <w:p>
-            <w:r/>
             <w:r>
               <w:rPr>
                 <w:sz w:val="20"/>
@@ -3233,16 +3064,15 @@
         <w:rPr>
           <w:color w:val="1F2B4A"/>
         </w:rPr>
-        <w:t>9. Conclusion</w:t>
+        <w:t>9. Conclusión</w:t>
       </w:r>
     </w:p>
     <w:p>
       <w:r>
         <w:rPr>
-          <w:i w:val="0"/>
           <w:sz w:val="22"/>
         </w:rPr>
-        <w:t>El proyecto cumple los requisitos del curso: una aplicacion web con datos maestros y transaccionales, CRUD completo, autenticacion con roles diferenciados y el flujo de check-in/check-out. Se cuido la calidad (codigo limpio, sin librerias innecesarias, responsive) y se documentaron las decisiones de construccion para poder sustentarlas.</w:t>
+        <w:t>El proyecto cumple los requisitos del curso: una aplicación web con datos maestros y transaccionales, CRUD completo, autenticación con roles diferenciados y el flujo de check-in/check-out. Se cuidó la calidad (código limpio, sin librerías innecesarias, responsive) y se documentaron las decisiones de construcción para poder sustentarlas.</w:t>
       </w:r>
     </w:p>
     <w:sectPr>

</xml_diff>